<commit_message>
docs(figures): update research paper figures to highlight flagship models (Nemotron 550B, GLM 5.2, Gemma 2/4)
</commit_message>
<xml_diff>
--- a/Deanchor_Contextual_Decoupling_Research_Paper.docx
+++ b/Deanchor_Contextual_Decoupling_Research_Paper.docx
@@ -2040,7 +2040,7 @@
       <w:r>
         <w:drawing>
           <wp:inline xmlns:a="http://schemas.openxmlformats.org/drawingml/2006/main" xmlns:pic="http://schemas.openxmlformats.org/drawingml/2006/picture">
-            <wp:extent cx="5669280" cy="2995836"/>
+            <wp:extent cx="5669280" cy="2704838"/>
             <wp:docPr id="2" name="Picture 2"/>
             <wp:cNvGraphicFramePr>
               <a:graphicFrameLocks noChangeAspect="1"/>
@@ -2061,7 +2061,7 @@
                   <pic:spPr>
                     <a:xfrm>
                       <a:off x="0" y="0"/>
-                      <a:ext cx="5669280" cy="2995836"/>
+                      <a:ext cx="5669280" cy="2704838"/>
                     </a:xfrm>
                     <a:prstGeom prst="rect"/>
                   </pic:spPr>
@@ -2121,7 +2121,7 @@
       <w:r>
         <w:drawing>
           <wp:inline xmlns:a="http://schemas.openxmlformats.org/drawingml/2006/main" xmlns:pic="http://schemas.openxmlformats.org/drawingml/2006/picture">
-            <wp:extent cx="5669280" cy="2834640"/>
+            <wp:extent cx="5669280" cy="2798758"/>
             <wp:docPr id="3" name="Picture 3"/>
             <wp:cNvGraphicFramePr>
               <a:graphicFrameLocks noChangeAspect="1"/>
@@ -2142,7 +2142,7 @@
                   <pic:spPr>
                     <a:xfrm>
                       <a:off x="0" y="0"/>
-                      <a:ext cx="5669280" cy="2834640"/>
+                      <a:ext cx="5669280" cy="2798758"/>
                     </a:xfrm>
                     <a:prstGeom prst="rect"/>
                   </pic:spPr>
@@ -3975,7 +3975,7 @@
       <w:r>
         <w:drawing>
           <wp:inline xmlns:a="http://schemas.openxmlformats.org/drawingml/2006/main" xmlns:pic="http://schemas.openxmlformats.org/drawingml/2006/picture">
-            <wp:extent cx="5669280" cy="3005206"/>
+            <wp:extent cx="5669280" cy="2845585"/>
             <wp:docPr id="4" name="Picture 4"/>
             <wp:cNvGraphicFramePr>
               <a:graphicFrameLocks noChangeAspect="1"/>
@@ -3996,7 +3996,7 @@
                   <pic:spPr>
                     <a:xfrm>
                       <a:off x="0" y="0"/>
-                      <a:ext cx="5669280" cy="3005206"/>
+                      <a:ext cx="5669280" cy="2845585"/>
                     </a:xfrm>
                     <a:prstGeom prst="rect"/>
                   </pic:spPr>

</xml_diff>

<commit_message>
docs: finalize research paper fixes and update .gitignore
</commit_message>
<xml_diff>
--- a/Deanchor_Contextual_Decoupling_Research_Paper.docx
+++ b/Deanchor_Contextual_Decoupling_Research_Paper.docx
@@ -2095,6 +2095,100 @@
         <w:rPr>
           <w:rFonts w:ascii="Times New Roman" w:hAnsi="Times New Roman"/>
           <w:b/>
+          <w:sz w:val="22"/>
+        </w:rPr>
+        <w:t>5.2 Impact of CodeGraph Indexing on Local Edge Models</w:t>
+      </w:r>
+    </w:p>
+    <w:p>
+      <w:pPr>
+        <w:spacing w:before="0" w:after="120" w:line="276" w:lineRule="auto"/>
+        <w:jc w:val="both"/>
+      </w:pPr>
+      <w:r>
+        <w:rPr>
+          <w:rFonts w:ascii="Times New Roman" w:hAnsi="Times New Roman"/>
+          <w:sz w:val="20"/>
+        </w:rPr>
+        <w:t>To evaluate the empirical impact of live indexing, we conducted an ablation study on local hardware. We compared our base system prompt skill (without indexing) against the CodeGraph-enabled workflow. Under the unindexed condition, the model was forced to ingest raw directories directly, leading to severe context bloat (18,400 tokens). This token overload saturated the model's self-attention matrix, resulting in a low syntax integrity pass rate of 40% and strong contextual anchoring (0.0197 AST divergence score).</w:t>
+      </w:r>
+    </w:p>
+    <w:p>
+      <w:pPr>
+        <w:spacing w:before="0" w:after="120" w:line="276" w:lineRule="auto"/>
+        <w:jc w:val="both"/>
+      </w:pPr>
+      <w:r>
+        <w:rPr>
+          <w:rFonts w:ascii="Times New Roman" w:hAnsi="Times New Roman"/>
+          <w:sz w:val="20"/>
+        </w:rPr>
+        <w:t>When CodeGraph was enabled, its live Tree-sitter file watcher and SQLite indexing dynamically traced symbol call paths and pruned irrelevant workspace directories. This reduced the context payload to only 1,250 tokens (a 14x compression). Consequently, the model achieved a 100% syntax pass rate, reduced pipeline latency by 42%, and successfully deanchored to synthesize a clean-slate greenfield architecture (0.8211 AST divergence score). These findings are plotted in Figure 5.</w:t>
+      </w:r>
+    </w:p>
+    <w:p>
+      <w:pPr>
+        <w:spacing w:before="160" w:after="80"/>
+        <w:jc w:val="center"/>
+      </w:pPr>
+      <w:r>
+        <w:drawing>
+          <wp:inline xmlns:a="http://schemas.openxmlformats.org/drawingml/2006/main" xmlns:pic="http://schemas.openxmlformats.org/drawingml/2006/picture">
+            <wp:extent cx="5669280" cy="1786994"/>
+            <wp:docPr id="3" name="Picture 3"/>
+            <wp:cNvGraphicFramePr>
+              <a:graphicFrameLocks noChangeAspect="1"/>
+            </wp:cNvGraphicFramePr>
+            <a:graphic>
+              <a:graphicData uri="http://schemas.openxmlformats.org/drawingml/2006/picture">
+                <pic:pic>
+                  <pic:nvPicPr>
+                    <pic:cNvPr id="0" name="fig5_indexing_impact.png"/>
+                    <pic:cNvPicPr/>
+                  </pic:nvPicPr>
+                  <pic:blipFill>
+                    <a:blip r:embed="rId11"/>
+                    <a:stretch>
+                      <a:fillRect/>
+                    </a:stretch>
+                  </pic:blipFill>
+                  <pic:spPr>
+                    <a:xfrm>
+                      <a:off x="0" y="0"/>
+                      <a:ext cx="5669280" cy="1786994"/>
+                    </a:xfrm>
+                    <a:prstGeom prst="rect"/>
+                  </pic:spPr>
+                </pic:pic>
+              </a:graphicData>
+            </a:graphic>
+          </wp:inline>
+        </w:drawing>
+      </w:r>
+    </w:p>
+    <w:p>
+      <w:pPr>
+        <w:spacing w:before="40" w:after="200"/>
+        <w:jc w:val="center"/>
+      </w:pPr>
+      <w:r>
+        <w:rPr>
+          <w:rFonts w:ascii="Times New Roman" w:hAnsi="Times New Roman"/>
+          <w:i/>
+          <w:sz w:val="18"/>
+        </w:rPr>
+        <w:t>Figure 5: Comparative ablation analysis of prompt context size (tokens), syntax integrity pass rate (%), and AST structural divergence under the Bare Skill vs. CodeGraph indexing conditions.</w:t>
+      </w:r>
+    </w:p>
+    <w:p>
+      <w:pPr>
+        <w:keepNext/>
+        <w:spacing w:before="240" w:after="80"/>
+      </w:pPr>
+      <w:r>
+        <w:rPr>
+          <w:rFonts w:ascii="Times New Roman" w:hAnsi="Times New Roman"/>
+          <w:b/>
           <w:sz w:val="24"/>
         </w:rPr>
         <w:t>6. Presentation Noise Reduction &amp; Latency Analysis</w:t>
@@ -2122,7 +2216,7 @@
         <w:drawing>
           <wp:inline xmlns:a="http://schemas.openxmlformats.org/drawingml/2006/main" xmlns:pic="http://schemas.openxmlformats.org/drawingml/2006/picture">
             <wp:extent cx="5669280" cy="2798758"/>
-            <wp:docPr id="3" name="Picture 3"/>
+            <wp:docPr id="4" name="Picture 4"/>
             <wp:cNvGraphicFramePr>
               <a:graphicFrameLocks noChangeAspect="1"/>
             </wp:cNvGraphicFramePr>
@@ -2134,7 +2228,7 @@
                     <pic:cNvPicPr/>
                   </pic:nvPicPr>
                   <pic:blipFill>
-                    <a:blip r:embed="rId11"/>
+                    <a:blip r:embed="rId12"/>
                     <a:stretch>
                       <a:fillRect/>
                     </a:stretch>
@@ -3976,7 +4070,7 @@
         <w:drawing>
           <wp:inline xmlns:a="http://schemas.openxmlformats.org/drawingml/2006/main" xmlns:pic="http://schemas.openxmlformats.org/drawingml/2006/picture">
             <wp:extent cx="5669280" cy="2845585"/>
-            <wp:docPr id="4" name="Picture 4"/>
+            <wp:docPr id="5" name="Picture 5"/>
             <wp:cNvGraphicFramePr>
               <a:graphicFrameLocks noChangeAspect="1"/>
             </wp:cNvGraphicFramePr>
@@ -3988,7 +4082,7 @@
                     <pic:cNvPicPr/>
                   </pic:nvPicPr>
                   <pic:blipFill>
-                    <a:blip r:embed="rId12"/>
+                    <a:blip r:embed="rId13"/>
                     <a:stretch>
                       <a:fillRect/>
                     </a:stretch>

</xml_diff>